<commit_message>
Add neural material reference papers
</commit_message>
<xml_diff>
--- a/Docs/UE5_Neural_Material_Plugin_Development_Spec.docx
+++ b/Docs/UE5_Neural_Material_Plugin_Development_Spec.docx
@@ -3922,6 +3922,11 @@
         <w:t>此文档应作为项目的长期 Agent Handoff/Architecture Spec。后续如果做出关键设计变化（例如 latent layout、MLP profile、训练 backend、UE Asset 格式、Material Expression 接口、Cooperative Vector 接入），应首先更新“核心决策”“数据契约”“里程碑”和“Agent 上下文约束”四个部分。</w:t>
       </w:r>
     </w:p>
+    <w:p>
+      <w:r>
+        <w:t>Ubisoft La Forge implementation reference: Shipping Neural Texture Compression in Assassins Creed Mirage - https://www.ubisoft.com/en-us/studio/laforge/news/415slmB3ZGzv8d2LhO9QT/shipping-neural-texture-compression-in-assassins-creed-mirage</w:t>
+      </w:r>
+    </w:p>
     <w:sectPr>
       <w:footerReference w:type="default" r:id="rId9"/>
       <w:pgSz w:w="12240" w:h="15840"/>

</xml_diff>